<commit_message>
Tony Tornado: revisão da Parte 2
Co-Authored-By: Claude Opus 5.5 <noreply@anthropic.com>
Claude-Session: https://claude.ai/code/session_01MJjUEEZrxQDEUifKK2vj9g
</commit_message>
<xml_diff>
--- a/roteiros/tony-tornado/Tony_Parte2.docx
+++ b/roteiros/tony-tornado/Tony_Parte2.docx
@@ -15,7 +15,7 @@
         <w:rPr>
           <w:color w:val="000000"/>
         </w:rPr>
-        <w:t>Os anos seguintes trouxeram Antônio de volta ao Rio de Janeiro.</w:t>
+        <w:t>Antes de chegar a esse bairro, Antônio ainda ia ganhar um nome novo. O nome que, até hoje, o Brasil inteiro conhece.</w:t>
       </w:r>
     </w:p>
     <w:p>
@@ -23,7 +23,15 @@
         <w:rPr>
           <w:color w:val="000000"/>
         </w:rPr>
-        <w:t>Já fora do Exército, ele encontrou uma cidade que tinha mudado de ritmo.</w:t>
+        <w:t>E esse nome nasceu de uma dança.</w:t>
+      </w:r>
+    </w:p>
+    <w:p>
+      <w:r>
+        <w:rPr>
+          <w:color w:val="000000"/>
+        </w:rPr>
+        <w:t>De volta ao Rio de Janeiro e já fora do Exército, ele encontrou uma cidade que tinha mudado de ritmo.</w:t>
       </w:r>
     </w:p>
     <w:p>
@@ -175,7 +183,7 @@
         <w:rPr>
           <w:color w:val="000000"/>
         </w:rPr>
-        <w:t>Anos depois, ele mesmo contou o que aconteceu.</w:t>
+        <w:t>Ele mesmo explicou, numa entrevista, o que aconteceu.</w:t>
       </w:r>
     </w:p>
     <w:p>
@@ -239,7 +247,7 @@
         <w:rPr>
           <w:color w:val="000000"/>
         </w:rPr>
-        <w:t>Sem família por perto para pedir ajuda. Sem consulado onde pudesse aparecer sem medo.</w:t>
+        <w:t>Sem família por perto para pedir ajuda.</w:t>
       </w:r>
     </w:p>
     <w:p>
@@ -463,7 +471,7 @@
         <w:rPr>
           <w:color w:val="000000"/>
         </w:rPr>
-        <w:t>Duas semanas depois, essa tensão explodiu bem ali, nas ruas onde ele morava.</w:t>
+        <w:t>Duas semanas depois, em Nova York, um policial branco, fora de serviço, matou a tiros um adolescente negro de quinze anos chamado James Powell.</w:t>
       </w:r>
     </w:p>
     <w:p>
@@ -471,7 +479,7 @@
         <w:rPr>
           <w:color w:val="000000"/>
         </w:rPr>
-        <w:t>Um policial branco, fora de serviço, matou a tiros um adolescente negro de quinze anos chamado James Powell.</w:t>
+        <w:t>Dois dias mais tarde, a tensão explodiu bem ali, nas ruas onde Tony morava.</w:t>
       </w:r>
     </w:p>
     <w:p>
@@ -519,7 +527,7 @@
         <w:rPr>
           <w:color w:val="000000"/>
         </w:rPr>
-        <w:t>Anos depois, ele contou quem eram as pessoas que escutava naquelas ruas.</w:t>
+        <w:t>Ele lembra bem quem eram as pessoas que escutava naquelas ruas.</w:t>
       </w:r>
     </w:p>
     <w:p>
@@ -655,7 +663,7 @@
         <w:rPr>
           <w:color w:val="000000"/>
         </w:rPr>
-        <w:t>Ele contou anos depois como foi.</w:t>
+        <w:t>Ele lembra exatamente das palavras.</w:t>
       </w:r>
     </w:p>
     <w:p>
@@ -687,7 +695,7 @@
         <w:rPr>
           <w:color w:val="000000"/>
         </w:rPr>
-        <w:t>Era Sebastião. O rapaz que o Brasil inteiro, anos depois, ia conhecer como Tim Maia.</w:t>
+        <w:t>Era Sebastião. O rapaz da Tijuca que o Brasil inteiro ainda ia conhecer como Tim Maia.</w:t>
       </w:r>
     </w:p>
     <w:p>
@@ -719,7 +727,7 @@
         <w:rPr>
           <w:color w:val="000000"/>
         </w:rPr>
-        <w:t>Agora repare em alguns detalhes estranhos desse encontro.</w:t>
+        <w:t>Repare em alguns detalhes estranhos desse encontro.</w:t>
       </w:r>
     </w:p>
     <w:p>
@@ -831,7 +839,7 @@
         <w:rPr>
           <w:color w:val="000000"/>
         </w:rPr>
-        <w:t>Anos depois, contou essa conta à revista Trip.</w:t>
+        <w:t>Foi assim que ele explicou essa conta à revista Trip.</w:t>
       </w:r>
     </w:p>
     <w:p>
@@ -1039,7 +1047,7 @@
         <w:rPr>
           <w:color w:val="1F4EB4"/>
         </w:rPr>
-        <w:t>Anos depois, falando de Tim Maia, Tony comparou os dois. Disse que Sebastião era mais ilegal do que ele. Ele próprio, segundo contou, era ilegal, mas mais ou menos comportado.</w:t>
+        <w:t>Muito tempo depois, falando de Tim Maia, Tony comparou os dois. Disse que Sebastião era mais ilegal do que ele. Ele próprio, segundo contou, era ilegal, mas mais ou menos comportado.</w:t>
       </w:r>
     </w:p>
     <w:p>

</xml_diff>